<commit_message>
Murray River Rev G: Tablelands projects and referee
Co-Authored-By: Claude Opus 5.5 <noreply@anthropic.com>
Claude-Session: https://claude.ai/code/session_01RKGFyarCMuMinKYL7AiBap
</commit_message>
<xml_diff>
--- a/FP/VP527469/Final/JCE_FP_VP527469_Final_RevG.docx
+++ b/FP/VP527469/Final/JCE_FP_VP527469_Final_RevG.docx
@@ -355,7 +355,7 @@
         <w:rPr>
           <w:i w:val="0"/>
         </w:rPr>
-        <w:t>We state openly that JCE has not previously acted as CQA Engineer on a landfill cell liner. JCE's landfill experience is engineering for a landfill leachate storage facility for Tablelands Regional Council (QLD), and the landfill CQA record in this team is the partner's, set out in Section 8 and Form 3. Jayden brings council client experience,  site quality assurance and earthworks inspection experience on Defence and civil projects, the management of specialist sub-consultants to one program, and a single point of accountability to Council for hold point releases against the 30/09/2027 deadline for Cell 3.1.</w:t>
+        <w:t>We state openly that JCE has not previously acted as CQA Engineer on a landfill cell liner. JCE's landfill experience is engineering for a landfill leachate storage facility for Tablelands Regional Council (QLD), and the landfill CQA record in this team is the partner's, set out in Section 8 and Form 3. Jayden brings council client experience, site quality assurance and earthworks inspection experience on Defence and civil projects, the management of specialist sub-consultants to one program, and a single point of accountability to Council for hold point releases against the 30/09/2027 deadline for Cell 3.1.</w:t>
       </w:r>
     </w:p>
     <w:p>
@@ -2702,7 +2702,7 @@
         <w:rPr>
           <w:i w:val="0"/>
         </w:rPr>
-        <w:t>Jayden Callen leads every JCE commission personally. Experience relevant to this role, as recorded in his CV:</w:t>
+        <w:t>Jayden Callen leads every JCE commission personally. Experience relevant to this role:</w:t>
       </w:r>
     </w:p>
     <w:p>

</xml_diff>